<commit_message>
Fix subsidiary books count: 8 → 29 books in all RFP documents
https://claude.ai/code/session_017dN5p4ydjmP9FANJCeiS7m
</commit_message>
<xml_diff>
--- a/RFP_ERP_SYSTEM_AR.docx
+++ b/RFP_ERP_SYSTEM_AR.docx
@@ -1398,7 +1398,7 @@
           <w:sz w:val="26"/>
           <w:rtl/>
         </w:rPr>
-        <w:t>2.2 الدفاتر المساعدة الحكومية (8 دفاتر)</w:t>
+        <w:t>2.2 الدفاتر المساعدة الحكومية (29 دفتراً)</w:t>
       </w:r>
     </w:p>
     <w:tbl>
@@ -2029,7 +2029,7 @@
                 <w:rtl/>
                 <w:rtl/>
               </w:rPr>
-              <w:t>ترقيم تسلسلي قانوني لكل دفتر-سنة-فولية</w:t>
+              <w:t>إجمالي الحسابات النظامية المدينة (78 مكرر)</w:t>
             </w:r>
           </w:p>
         </w:tc>
@@ -2109,7 +2109,1927 @@
                 <w:rtl/>
                 <w:rtl/>
               </w:rPr>
+              <w:t>إجمالي الحسابات النظامية الدائنة (78 ع.ح)</w:t>
+            </w:r>
+          </w:p>
+        </w:tc>
+        <w:tc>
+          <w:tcPr>
+            <w:tcW w:type="dxa" w:w="3135"/>
+            <w:shd w:val="clear" w:color="auto" w:fill="FFFFFF"/>
+          </w:tcPr>
+          <w:p>
+            <w:pPr>
+              <w:bidi/>
+              <w:jc w:val="right"/>
+              <w:bidi/>
+            </w:pPr>
+            <w:r>
+              <w:rPr>
+                <w:rtl/>
+              </w:rPr>
+            </w:r>
+            <w:r>
+              <w:rPr>
+                <w:sz w:val="18"/>
+                <w:rtl/>
+                <w:rtl/>
+              </w:rPr>
+              <w:t>إلزامي</w:t>
+            </w:r>
+          </w:p>
+        </w:tc>
+      </w:tr>
+      <w:tr>
+        <w:tc>
+          <w:tcPr>
+            <w:tcW w:type="dxa" w:w="3135"/>
+            <w:shd w:val="clear" w:color="auto" w:fill="F2F2F2"/>
+          </w:tcPr>
+          <w:p>
+            <w:pPr>
+              <w:bidi/>
+              <w:jc w:val="right"/>
+              <w:bidi/>
+            </w:pPr>
+            <w:r>
+              <w:rPr>
+                <w:rtl/>
+              </w:rPr>
+            </w:r>
+            <w:r>
+              <w:rPr>
+                <w:sz w:val="18"/>
+                <w:rtl/>
+                <w:rtl/>
+              </w:rPr>
+              <w:t>9</w:t>
+            </w:r>
+          </w:p>
+        </w:tc>
+        <w:tc>
+          <w:tcPr>
+            <w:tcW w:type="dxa" w:w="3135"/>
+            <w:shd w:val="clear" w:color="auto" w:fill="F2F2F2"/>
+          </w:tcPr>
+          <w:p>
+            <w:pPr>
+              <w:bidi/>
+              <w:jc w:val="right"/>
+              <w:bidi/>
+            </w:pPr>
+            <w:r>
+              <w:rPr>
+                <w:rtl/>
+              </w:rPr>
+            </w:r>
+            <w:r>
+              <w:rPr>
+                <w:sz w:val="18"/>
+                <w:rtl/>
+                <w:rtl/>
+              </w:rPr>
+              <w:t>دفتر اليومية العامة (يومية 224)</w:t>
+            </w:r>
+          </w:p>
+        </w:tc>
+        <w:tc>
+          <w:tcPr>
+            <w:tcW w:type="dxa" w:w="3135"/>
+            <w:shd w:val="clear" w:color="auto" w:fill="F2F2F2"/>
+          </w:tcPr>
+          <w:p>
+            <w:pPr>
+              <w:bidi/>
+              <w:jc w:val="right"/>
+              <w:bidi/>
+            </w:pPr>
+            <w:r>
+              <w:rPr>
+                <w:rtl/>
+              </w:rPr>
+            </w:r>
+            <w:r>
+              <w:rPr>
+                <w:sz w:val="18"/>
+                <w:rtl/>
+                <w:rtl/>
+              </w:rPr>
+              <w:t>إلزامي</w:t>
+            </w:r>
+          </w:p>
+        </w:tc>
+      </w:tr>
+      <w:tr>
+        <w:tc>
+          <w:tcPr>
+            <w:tcW w:type="dxa" w:w="3135"/>
+            <w:shd w:val="clear" w:color="auto" w:fill="FFFFFF"/>
+          </w:tcPr>
+          <w:p>
+            <w:pPr>
+              <w:bidi/>
+              <w:jc w:val="right"/>
+              <w:bidi/>
+            </w:pPr>
+            <w:r>
+              <w:rPr>
+                <w:rtl/>
+              </w:rPr>
+            </w:r>
+            <w:r>
+              <w:rPr>
+                <w:sz w:val="18"/>
+                <w:rtl/>
+                <w:rtl/>
+              </w:rPr>
+              <w:t>10</w:t>
+            </w:r>
+          </w:p>
+        </w:tc>
+        <w:tc>
+          <w:tcPr>
+            <w:tcW w:type="dxa" w:w="3135"/>
+            <w:shd w:val="clear" w:color="auto" w:fill="FFFFFF"/>
+          </w:tcPr>
+          <w:p>
+            <w:pPr>
+              <w:bidi/>
+              <w:jc w:val="right"/>
+              <w:bidi/>
+            </w:pPr>
+            <w:r>
+              <w:rPr>
+                <w:rtl/>
+              </w:rPr>
+            </w:r>
+            <w:r>
+              <w:rPr>
+                <w:sz w:val="18"/>
+                <w:rtl/>
+                <w:rtl/>
+              </w:rPr>
+              <w:t>دفتر 55 ع.ح — اليومية المحاسبية</w:t>
+            </w:r>
+          </w:p>
+        </w:tc>
+        <w:tc>
+          <w:tcPr>
+            <w:tcW w:type="dxa" w:w="3135"/>
+            <w:shd w:val="clear" w:color="auto" w:fill="FFFFFF"/>
+          </w:tcPr>
+          <w:p>
+            <w:pPr>
+              <w:bidi/>
+              <w:jc w:val="right"/>
+              <w:bidi/>
+            </w:pPr>
+            <w:r>
+              <w:rPr>
+                <w:rtl/>
+              </w:rPr>
+            </w:r>
+            <w:r>
+              <w:rPr>
+                <w:sz w:val="18"/>
+                <w:rtl/>
+                <w:rtl/>
+              </w:rPr>
+              <w:t>إلزامي</w:t>
+            </w:r>
+          </w:p>
+        </w:tc>
+      </w:tr>
+      <w:tr>
+        <w:tc>
+          <w:tcPr>
+            <w:tcW w:type="dxa" w:w="3135"/>
+            <w:shd w:val="clear" w:color="auto" w:fill="F2F2F2"/>
+          </w:tcPr>
+          <w:p>
+            <w:pPr>
+              <w:bidi/>
+              <w:jc w:val="right"/>
+              <w:bidi/>
+            </w:pPr>
+            <w:r>
+              <w:rPr>
+                <w:rtl/>
+              </w:rPr>
+            </w:r>
+            <w:r>
+              <w:rPr>
+                <w:sz w:val="18"/>
+                <w:rtl/>
+                <w:rtl/>
+              </w:rPr>
+              <w:t>11</w:t>
+            </w:r>
+          </w:p>
+        </w:tc>
+        <w:tc>
+          <w:tcPr>
+            <w:tcW w:type="dxa" w:w="3135"/>
+            <w:shd w:val="clear" w:color="auto" w:fill="F2F2F2"/>
+          </w:tcPr>
+          <w:p>
+            <w:pPr>
+              <w:bidi/>
+              <w:jc w:val="right"/>
+              <w:bidi/>
+            </w:pPr>
+            <w:r>
+              <w:rPr>
+                <w:rtl/>
+              </w:rPr>
+            </w:r>
+            <w:r>
+              <w:rPr>
+                <w:sz w:val="18"/>
+                <w:rtl/>
+                <w:rtl/>
+              </w:rPr>
+              <w:t>دفتر الصندوق العام المدين</w:t>
+            </w:r>
+          </w:p>
+        </w:tc>
+        <w:tc>
+          <w:tcPr>
+            <w:tcW w:type="dxa" w:w="3135"/>
+            <w:shd w:val="clear" w:color="auto" w:fill="F2F2F2"/>
+          </w:tcPr>
+          <w:p>
+            <w:pPr>
+              <w:bidi/>
+              <w:jc w:val="right"/>
+              <w:bidi/>
+            </w:pPr>
+            <w:r>
+              <w:rPr>
+                <w:rtl/>
+              </w:rPr>
+            </w:r>
+            <w:r>
+              <w:rPr>
+                <w:sz w:val="18"/>
+                <w:rtl/>
+                <w:rtl/>
+              </w:rPr>
+              <w:t>إلزامي</w:t>
+            </w:r>
+          </w:p>
+        </w:tc>
+      </w:tr>
+      <w:tr>
+        <w:tc>
+          <w:tcPr>
+            <w:tcW w:type="dxa" w:w="3135"/>
+            <w:shd w:val="clear" w:color="auto" w:fill="FFFFFF"/>
+          </w:tcPr>
+          <w:p>
+            <w:pPr>
+              <w:bidi/>
+              <w:jc w:val="right"/>
+              <w:bidi/>
+            </w:pPr>
+            <w:r>
+              <w:rPr>
+                <w:rtl/>
+              </w:rPr>
+            </w:r>
+            <w:r>
+              <w:rPr>
+                <w:sz w:val="18"/>
+                <w:rtl/>
+                <w:rtl/>
+              </w:rPr>
+              <w:t>12</w:t>
+            </w:r>
+          </w:p>
+        </w:tc>
+        <w:tc>
+          <w:tcPr>
+            <w:tcW w:type="dxa" w:w="3135"/>
+            <w:shd w:val="clear" w:color="auto" w:fill="FFFFFF"/>
+          </w:tcPr>
+          <w:p>
+            <w:pPr>
+              <w:bidi/>
+              <w:jc w:val="right"/>
+              <w:bidi/>
+            </w:pPr>
+            <w:r>
+              <w:rPr>
+                <w:rtl/>
+              </w:rPr>
+            </w:r>
+            <w:r>
+              <w:rPr>
+                <w:sz w:val="18"/>
+                <w:rtl/>
+                <w:rtl/>
+              </w:rPr>
+              <w:t>دفتر الصندوق العام الدائن</w:t>
+            </w:r>
+          </w:p>
+        </w:tc>
+        <w:tc>
+          <w:tcPr>
+            <w:tcW w:type="dxa" w:w="3135"/>
+            <w:shd w:val="clear" w:color="auto" w:fill="FFFFFF"/>
+          </w:tcPr>
+          <w:p>
+            <w:pPr>
+              <w:bidi/>
+              <w:jc w:val="right"/>
+              <w:bidi/>
+            </w:pPr>
+            <w:r>
+              <w:rPr>
+                <w:rtl/>
+              </w:rPr>
+            </w:r>
+            <w:r>
+              <w:rPr>
+                <w:sz w:val="18"/>
+                <w:rtl/>
+                <w:rtl/>
+              </w:rPr>
+              <w:t>إلزامي</w:t>
+            </w:r>
+          </w:p>
+        </w:tc>
+      </w:tr>
+      <w:tr>
+        <w:tc>
+          <w:tcPr>
+            <w:tcW w:type="dxa" w:w="3135"/>
+            <w:shd w:val="clear" w:color="auto" w:fill="F2F2F2"/>
+          </w:tcPr>
+          <w:p>
+            <w:pPr>
+              <w:bidi/>
+              <w:jc w:val="right"/>
+              <w:bidi/>
+            </w:pPr>
+            <w:r>
+              <w:rPr>
+                <w:rtl/>
+              </w:rPr>
+            </w:r>
+            <w:r>
+              <w:rPr>
+                <w:sz w:val="18"/>
+                <w:rtl/>
+                <w:rtl/>
+              </w:rPr>
+              <w:t>13</w:t>
+            </w:r>
+          </w:p>
+        </w:tc>
+        <w:tc>
+          <w:tcPr>
+            <w:tcW w:type="dxa" w:w="3135"/>
+            <w:shd w:val="clear" w:color="auto" w:fill="F2F2F2"/>
+          </w:tcPr>
+          <w:p>
+            <w:pPr>
+              <w:bidi/>
+              <w:jc w:val="right"/>
+              <w:bidi/>
+            </w:pPr>
+            <w:r>
+              <w:rPr>
+                <w:rtl/>
+              </w:rPr>
+            </w:r>
+            <w:r>
+              <w:rPr>
+                <w:sz w:val="18"/>
+                <w:rtl/>
+                <w:rtl/>
+              </w:rPr>
+              <w:t>دفتر الإيرادات</w:t>
+            </w:r>
+          </w:p>
+        </w:tc>
+        <w:tc>
+          <w:tcPr>
+            <w:tcW w:type="dxa" w:w="3135"/>
+            <w:shd w:val="clear" w:color="auto" w:fill="F2F2F2"/>
+          </w:tcPr>
+          <w:p>
+            <w:pPr>
+              <w:bidi/>
+              <w:jc w:val="right"/>
+              <w:bidi/>
+            </w:pPr>
+            <w:r>
+              <w:rPr>
+                <w:rtl/>
+              </w:rPr>
+            </w:r>
+            <w:r>
+              <w:rPr>
+                <w:sz w:val="18"/>
+                <w:rtl/>
+                <w:rtl/>
+              </w:rPr>
+              <w:t>إلزامي</w:t>
+            </w:r>
+          </w:p>
+        </w:tc>
+      </w:tr>
+      <w:tr>
+        <w:tc>
+          <w:tcPr>
+            <w:tcW w:type="dxa" w:w="3135"/>
+            <w:shd w:val="clear" w:color="auto" w:fill="FFFFFF"/>
+          </w:tcPr>
+          <w:p>
+            <w:pPr>
+              <w:bidi/>
+              <w:jc w:val="right"/>
+              <w:bidi/>
+            </w:pPr>
+            <w:r>
+              <w:rPr>
+                <w:rtl/>
+              </w:rPr>
+            </w:r>
+            <w:r>
+              <w:rPr>
+                <w:sz w:val="18"/>
+                <w:rtl/>
+                <w:rtl/>
+              </w:rPr>
+              <w:t>14</w:t>
+            </w:r>
+          </w:p>
+        </w:tc>
+        <w:tc>
+          <w:tcPr>
+            <w:tcW w:type="dxa" w:w="3135"/>
+            <w:shd w:val="clear" w:color="auto" w:fill="FFFFFF"/>
+          </w:tcPr>
+          <w:p>
+            <w:pPr>
+              <w:bidi/>
+              <w:jc w:val="right"/>
+              <w:bidi/>
+            </w:pPr>
+            <w:r>
+              <w:rPr>
+                <w:rtl/>
+              </w:rPr>
+            </w:r>
+            <w:r>
+              <w:rPr>
+                <w:sz w:val="18"/>
+                <w:rtl/>
+                <w:rtl/>
+              </w:rPr>
+              <w:t>دفتر المصروفات</w:t>
+            </w:r>
+          </w:p>
+        </w:tc>
+        <w:tc>
+          <w:tcPr>
+            <w:tcW w:type="dxa" w:w="3135"/>
+            <w:shd w:val="clear" w:color="auto" w:fill="FFFFFF"/>
+          </w:tcPr>
+          <w:p>
+            <w:pPr>
+              <w:bidi/>
+              <w:jc w:val="right"/>
+              <w:bidi/>
+            </w:pPr>
+            <w:r>
+              <w:rPr>
+                <w:rtl/>
+              </w:rPr>
+            </w:r>
+            <w:r>
+              <w:rPr>
+                <w:sz w:val="18"/>
+                <w:rtl/>
+                <w:rtl/>
+              </w:rPr>
+              <w:t>إلزامي</w:t>
+            </w:r>
+          </w:p>
+        </w:tc>
+      </w:tr>
+      <w:tr>
+        <w:tc>
+          <w:tcPr>
+            <w:tcW w:type="dxa" w:w="3135"/>
+            <w:shd w:val="clear" w:color="auto" w:fill="F2F2F2"/>
+          </w:tcPr>
+          <w:p>
+            <w:pPr>
+              <w:bidi/>
+              <w:jc w:val="right"/>
+              <w:bidi/>
+            </w:pPr>
+            <w:r>
+              <w:rPr>
+                <w:rtl/>
+              </w:rPr>
+            </w:r>
+            <w:r>
+              <w:rPr>
+                <w:sz w:val="18"/>
+                <w:rtl/>
+                <w:rtl/>
+              </w:rPr>
+              <w:t>15</w:t>
+            </w:r>
+          </w:p>
+        </w:tc>
+        <w:tc>
+          <w:tcPr>
+            <w:tcW w:type="dxa" w:w="3135"/>
+            <w:shd w:val="clear" w:color="auto" w:fill="F2F2F2"/>
+          </w:tcPr>
+          <w:p>
+            <w:pPr>
+              <w:bidi/>
+              <w:jc w:val="right"/>
+              <w:bidi/>
+            </w:pPr>
+            <w:r>
+              <w:rPr>
+                <w:rtl/>
+              </w:rPr>
+            </w:r>
+            <w:r>
+              <w:rPr>
+                <w:sz w:val="18"/>
+                <w:rtl/>
+                <w:rtl/>
+              </w:rPr>
+              <w:t>دفتر الشيكات الواردة</w:t>
+            </w:r>
+          </w:p>
+        </w:tc>
+        <w:tc>
+          <w:tcPr>
+            <w:tcW w:type="dxa" w:w="3135"/>
+            <w:shd w:val="clear" w:color="auto" w:fill="F2F2F2"/>
+          </w:tcPr>
+          <w:p>
+            <w:pPr>
+              <w:bidi/>
+              <w:jc w:val="right"/>
+              <w:bidi/>
+            </w:pPr>
+            <w:r>
+              <w:rPr>
+                <w:rtl/>
+              </w:rPr>
+            </w:r>
+            <w:r>
+              <w:rPr>
+                <w:sz w:val="18"/>
+                <w:rtl/>
+                <w:rtl/>
+              </w:rPr>
+              <w:t>إلزامي</w:t>
+            </w:r>
+          </w:p>
+        </w:tc>
+      </w:tr>
+      <w:tr>
+        <w:tc>
+          <w:tcPr>
+            <w:tcW w:type="dxa" w:w="3135"/>
+            <w:shd w:val="clear" w:color="auto" w:fill="FFFFFF"/>
+          </w:tcPr>
+          <w:p>
+            <w:pPr>
+              <w:bidi/>
+              <w:jc w:val="right"/>
+              <w:bidi/>
+            </w:pPr>
+            <w:r>
+              <w:rPr>
+                <w:rtl/>
+              </w:rPr>
+            </w:r>
+            <w:r>
+              <w:rPr>
+                <w:sz w:val="18"/>
+                <w:rtl/>
+                <w:rtl/>
+              </w:rPr>
+              <w:t>16</w:t>
+            </w:r>
+          </w:p>
+        </w:tc>
+        <w:tc>
+          <w:tcPr>
+            <w:tcW w:type="dxa" w:w="3135"/>
+            <w:shd w:val="clear" w:color="auto" w:fill="FFFFFF"/>
+          </w:tcPr>
+          <w:p>
+            <w:pPr>
+              <w:bidi/>
+              <w:jc w:val="right"/>
+              <w:bidi/>
+            </w:pPr>
+            <w:r>
+              <w:rPr>
+                <w:rtl/>
+              </w:rPr>
+            </w:r>
+            <w:r>
+              <w:rPr>
+                <w:sz w:val="18"/>
+                <w:rtl/>
+                <w:rtl/>
+              </w:rPr>
+              <w:t>دفتر الشيكات الصادرة</w:t>
+            </w:r>
+          </w:p>
+        </w:tc>
+        <w:tc>
+          <w:tcPr>
+            <w:tcW w:type="dxa" w:w="3135"/>
+            <w:shd w:val="clear" w:color="auto" w:fill="FFFFFF"/>
+          </w:tcPr>
+          <w:p>
+            <w:pPr>
+              <w:bidi/>
+              <w:jc w:val="right"/>
+              <w:bidi/>
+            </w:pPr>
+            <w:r>
+              <w:rPr>
+                <w:rtl/>
+              </w:rPr>
+            </w:r>
+            <w:r>
+              <w:rPr>
+                <w:sz w:val="18"/>
+                <w:rtl/>
+                <w:rtl/>
+              </w:rPr>
+              <w:t>إلزامي</w:t>
+            </w:r>
+          </w:p>
+        </w:tc>
+      </w:tr>
+      <w:tr>
+        <w:tc>
+          <w:tcPr>
+            <w:tcW w:type="dxa" w:w="3135"/>
+            <w:shd w:val="clear" w:color="auto" w:fill="F2F2F2"/>
+          </w:tcPr>
+          <w:p>
+            <w:pPr>
+              <w:bidi/>
+              <w:jc w:val="right"/>
+              <w:bidi/>
+            </w:pPr>
+            <w:r>
+              <w:rPr>
+                <w:rtl/>
+              </w:rPr>
+            </w:r>
+            <w:r>
+              <w:rPr>
+                <w:sz w:val="18"/>
+                <w:rtl/>
+                <w:rtl/>
+              </w:rPr>
+              <w:t>17</w:t>
+            </w:r>
+          </w:p>
+        </w:tc>
+        <w:tc>
+          <w:tcPr>
+            <w:tcW w:type="dxa" w:w="3135"/>
+            <w:shd w:val="clear" w:color="auto" w:fill="F2F2F2"/>
+          </w:tcPr>
+          <w:p>
+            <w:pPr>
+              <w:bidi/>
+              <w:jc w:val="right"/>
+              <w:bidi/>
+            </w:pPr>
+            <w:r>
+              <w:rPr>
+                <w:rtl/>
+              </w:rPr>
+            </w:r>
+            <w:r>
+              <w:rPr>
+                <w:sz w:val="18"/>
+                <w:rtl/>
+                <w:rtl/>
+              </w:rPr>
+              <w:t>دفتر التأمينات والودائع</w:t>
+            </w:r>
+          </w:p>
+        </w:tc>
+        <w:tc>
+          <w:tcPr>
+            <w:tcW w:type="dxa" w:w="3135"/>
+            <w:shd w:val="clear" w:color="auto" w:fill="F2F2F2"/>
+          </w:tcPr>
+          <w:p>
+            <w:pPr>
+              <w:bidi/>
+              <w:jc w:val="right"/>
+              <w:bidi/>
+            </w:pPr>
+            <w:r>
+              <w:rPr>
+                <w:rtl/>
+              </w:rPr>
+            </w:r>
+            <w:r>
+              <w:rPr>
+                <w:sz w:val="18"/>
+                <w:rtl/>
+                <w:rtl/>
+              </w:rPr>
+              <w:t>إلزامي</w:t>
+            </w:r>
+          </w:p>
+        </w:tc>
+      </w:tr>
+      <w:tr>
+        <w:tc>
+          <w:tcPr>
+            <w:tcW w:type="dxa" w:w="3135"/>
+            <w:shd w:val="clear" w:color="auto" w:fill="FFFFFF"/>
+          </w:tcPr>
+          <w:p>
+            <w:pPr>
+              <w:bidi/>
+              <w:jc w:val="right"/>
+              <w:bidi/>
+            </w:pPr>
+            <w:r>
+              <w:rPr>
+                <w:rtl/>
+              </w:rPr>
+            </w:r>
+            <w:r>
+              <w:rPr>
+                <w:sz w:val="18"/>
+                <w:rtl/>
+                <w:rtl/>
+              </w:rPr>
+              <w:t>18</w:t>
+            </w:r>
+          </w:p>
+        </w:tc>
+        <w:tc>
+          <w:tcPr>
+            <w:tcW w:type="dxa" w:w="3135"/>
+            <w:shd w:val="clear" w:color="auto" w:fill="FFFFFF"/>
+          </w:tcPr>
+          <w:p>
+            <w:pPr>
+              <w:bidi/>
+              <w:jc w:val="right"/>
+              <w:bidi/>
+            </w:pPr>
+            <w:r>
+              <w:rPr>
+                <w:rtl/>
+              </w:rPr>
+            </w:r>
+            <w:r>
+              <w:rPr>
+                <w:sz w:val="18"/>
+                <w:rtl/>
+                <w:rtl/>
+              </w:rPr>
+              <w:t>دفتر السلف والعهد</w:t>
+            </w:r>
+          </w:p>
+        </w:tc>
+        <w:tc>
+          <w:tcPr>
+            <w:tcW w:type="dxa" w:w="3135"/>
+            <w:shd w:val="clear" w:color="auto" w:fill="FFFFFF"/>
+          </w:tcPr>
+          <w:p>
+            <w:pPr>
+              <w:bidi/>
+              <w:jc w:val="right"/>
+              <w:bidi/>
+            </w:pPr>
+            <w:r>
+              <w:rPr>
+                <w:rtl/>
+              </w:rPr>
+            </w:r>
+            <w:r>
+              <w:rPr>
+                <w:sz w:val="18"/>
+                <w:rtl/>
+                <w:rtl/>
+              </w:rPr>
+              <w:t>إلزامي</w:t>
+            </w:r>
+          </w:p>
+        </w:tc>
+      </w:tr>
+      <w:tr>
+        <w:tc>
+          <w:tcPr>
+            <w:tcW w:type="dxa" w:w="3135"/>
+            <w:shd w:val="clear" w:color="auto" w:fill="F2F2F2"/>
+          </w:tcPr>
+          <w:p>
+            <w:pPr>
+              <w:bidi/>
+              <w:jc w:val="right"/>
+              <w:bidi/>
+            </w:pPr>
+            <w:r>
+              <w:rPr>
+                <w:rtl/>
+              </w:rPr>
+            </w:r>
+            <w:r>
+              <w:rPr>
+                <w:sz w:val="18"/>
+                <w:rtl/>
+                <w:rtl/>
+              </w:rPr>
+              <w:t>19</w:t>
+            </w:r>
+          </w:p>
+        </w:tc>
+        <w:tc>
+          <w:tcPr>
+            <w:tcW w:type="dxa" w:w="3135"/>
+            <w:shd w:val="clear" w:color="auto" w:fill="F2F2F2"/>
+          </w:tcPr>
+          <w:p>
+            <w:pPr>
+              <w:bidi/>
+              <w:jc w:val="right"/>
+              <w:bidi/>
+            </w:pPr>
+            <w:r>
+              <w:rPr>
+                <w:rtl/>
+              </w:rPr>
+            </w:r>
+            <w:r>
+              <w:rPr>
+                <w:sz w:val="18"/>
+                <w:rtl/>
+                <w:rtl/>
+              </w:rPr>
+              <w:t>دفتر التحويلات الخزينية</w:t>
+            </w:r>
+          </w:p>
+        </w:tc>
+        <w:tc>
+          <w:tcPr>
+            <w:tcW w:type="dxa" w:w="3135"/>
+            <w:shd w:val="clear" w:color="auto" w:fill="F2F2F2"/>
+          </w:tcPr>
+          <w:p>
+            <w:pPr>
+              <w:bidi/>
+              <w:jc w:val="right"/>
+              <w:bidi/>
+            </w:pPr>
+            <w:r>
+              <w:rPr>
+                <w:rtl/>
+              </w:rPr>
+            </w:r>
+            <w:r>
+              <w:rPr>
+                <w:sz w:val="18"/>
+                <w:rtl/>
+                <w:rtl/>
+              </w:rPr>
+              <w:t>إلزامي</w:t>
+            </w:r>
+          </w:p>
+        </w:tc>
+      </w:tr>
+      <w:tr>
+        <w:tc>
+          <w:tcPr>
+            <w:tcW w:type="dxa" w:w="3135"/>
+            <w:shd w:val="clear" w:color="auto" w:fill="FFFFFF"/>
+          </w:tcPr>
+          <w:p>
+            <w:pPr>
+              <w:bidi/>
+              <w:jc w:val="right"/>
+              <w:bidi/>
+            </w:pPr>
+            <w:r>
+              <w:rPr>
+                <w:rtl/>
+              </w:rPr>
+            </w:r>
+            <w:r>
+              <w:rPr>
+                <w:sz w:val="18"/>
+                <w:rtl/>
+                <w:rtl/>
+              </w:rPr>
+              <w:t>20</w:t>
+            </w:r>
+          </w:p>
+        </w:tc>
+        <w:tc>
+          <w:tcPr>
+            <w:tcW w:type="dxa" w:w="3135"/>
+            <w:shd w:val="clear" w:color="auto" w:fill="FFFFFF"/>
+          </w:tcPr>
+          <w:p>
+            <w:pPr>
+              <w:bidi/>
+              <w:jc w:val="right"/>
+              <w:bidi/>
+            </w:pPr>
+            <w:r>
+              <w:rPr>
+                <w:rtl/>
+              </w:rPr>
+            </w:r>
+            <w:r>
+              <w:rPr>
+                <w:sz w:val="18"/>
+                <w:rtl/>
+                <w:rtl/>
+              </w:rPr>
+              <w:t>دفتر الالتزامات</w:t>
+            </w:r>
+          </w:p>
+        </w:tc>
+        <w:tc>
+          <w:tcPr>
+            <w:tcW w:type="dxa" w:w="3135"/>
+            <w:shd w:val="clear" w:color="auto" w:fill="FFFFFF"/>
+          </w:tcPr>
+          <w:p>
+            <w:pPr>
+              <w:bidi/>
+              <w:jc w:val="right"/>
+              <w:bidi/>
+            </w:pPr>
+            <w:r>
+              <w:rPr>
+                <w:rtl/>
+              </w:rPr>
+            </w:r>
+            <w:r>
+              <w:rPr>
+                <w:sz w:val="18"/>
+                <w:rtl/>
+                <w:rtl/>
+              </w:rPr>
+              <w:t>إلزامي</w:t>
+            </w:r>
+          </w:p>
+        </w:tc>
+      </w:tr>
+      <w:tr>
+        <w:tc>
+          <w:tcPr>
+            <w:tcW w:type="dxa" w:w="3135"/>
+            <w:shd w:val="clear" w:color="auto" w:fill="F2F2F2"/>
+          </w:tcPr>
+          <w:p>
+            <w:pPr>
+              <w:bidi/>
+              <w:jc w:val="right"/>
+              <w:bidi/>
+            </w:pPr>
+            <w:r>
+              <w:rPr>
+                <w:rtl/>
+              </w:rPr>
+            </w:r>
+            <w:r>
+              <w:rPr>
+                <w:sz w:val="18"/>
+                <w:rtl/>
+                <w:rtl/>
+              </w:rPr>
+              <w:t>21</w:t>
+            </w:r>
+          </w:p>
+        </w:tc>
+        <w:tc>
+          <w:tcPr>
+            <w:tcW w:type="dxa" w:w="3135"/>
+            <w:shd w:val="clear" w:color="auto" w:fill="F2F2F2"/>
+          </w:tcPr>
+          <w:p>
+            <w:pPr>
+              <w:bidi/>
+              <w:jc w:val="right"/>
+              <w:bidi/>
+            </w:pPr>
+            <w:r>
+              <w:rPr>
+                <w:rtl/>
+              </w:rPr>
+            </w:r>
+            <w:r>
+              <w:rPr>
+                <w:sz w:val="18"/>
+                <w:rtl/>
+                <w:rtl/>
+              </w:rPr>
+              <w:t>دفتر أوامر الصرف (استمارة 50)</w:t>
+            </w:r>
+          </w:p>
+        </w:tc>
+        <w:tc>
+          <w:tcPr>
+            <w:tcW w:type="dxa" w:w="3135"/>
+            <w:shd w:val="clear" w:color="auto" w:fill="F2F2F2"/>
+          </w:tcPr>
+          <w:p>
+            <w:pPr>
+              <w:bidi/>
+              <w:jc w:val="right"/>
+              <w:bidi/>
+            </w:pPr>
+            <w:r>
+              <w:rPr>
+                <w:rtl/>
+              </w:rPr>
+            </w:r>
+            <w:r>
+              <w:rPr>
+                <w:sz w:val="18"/>
+                <w:rtl/>
+                <w:rtl/>
+              </w:rPr>
+              <w:t>إلزامي</w:t>
+            </w:r>
+          </w:p>
+        </w:tc>
+      </w:tr>
+      <w:tr>
+        <w:tc>
+          <w:tcPr>
+            <w:tcW w:type="dxa" w:w="3135"/>
+            <w:shd w:val="clear" w:color="auto" w:fill="FFFFFF"/>
+          </w:tcPr>
+          <w:p>
+            <w:pPr>
+              <w:bidi/>
+              <w:jc w:val="right"/>
+              <w:bidi/>
+            </w:pPr>
+            <w:r>
+              <w:rPr>
+                <w:rtl/>
+              </w:rPr>
+            </w:r>
+            <w:r>
+              <w:rPr>
+                <w:sz w:val="18"/>
+                <w:rtl/>
+                <w:rtl/>
+              </w:rPr>
+              <w:t>22</w:t>
+            </w:r>
+          </w:p>
+        </w:tc>
+        <w:tc>
+          <w:tcPr>
+            <w:tcW w:type="dxa" w:w="3135"/>
+            <w:shd w:val="clear" w:color="auto" w:fill="FFFFFF"/>
+          </w:tcPr>
+          <w:p>
+            <w:pPr>
+              <w:bidi/>
+              <w:jc w:val="right"/>
+              <w:bidi/>
+            </w:pPr>
+            <w:r>
+              <w:rPr>
+                <w:rtl/>
+              </w:rPr>
+            </w:r>
+            <w:r>
+              <w:rPr>
+                <w:sz w:val="18"/>
+                <w:rtl/>
+                <w:rtl/>
+              </w:rPr>
+              <w:t>دفتر المستودع — الوارد</w:t>
+            </w:r>
+          </w:p>
+        </w:tc>
+        <w:tc>
+          <w:tcPr>
+            <w:tcW w:type="dxa" w:w="3135"/>
+            <w:shd w:val="clear" w:color="auto" w:fill="FFFFFF"/>
+          </w:tcPr>
+          <w:p>
+            <w:pPr>
+              <w:bidi/>
+              <w:jc w:val="right"/>
+              <w:bidi/>
+            </w:pPr>
+            <w:r>
+              <w:rPr>
+                <w:rtl/>
+              </w:rPr>
+            </w:r>
+            <w:r>
+              <w:rPr>
+                <w:sz w:val="18"/>
+                <w:rtl/>
+                <w:rtl/>
+              </w:rPr>
+              <w:t>إلزامي</w:t>
+            </w:r>
+          </w:p>
+        </w:tc>
+      </w:tr>
+      <w:tr>
+        <w:tc>
+          <w:tcPr>
+            <w:tcW w:type="dxa" w:w="3135"/>
+            <w:shd w:val="clear" w:color="auto" w:fill="F2F2F2"/>
+          </w:tcPr>
+          <w:p>
+            <w:pPr>
+              <w:bidi/>
+              <w:jc w:val="right"/>
+              <w:bidi/>
+            </w:pPr>
+            <w:r>
+              <w:rPr>
+                <w:rtl/>
+              </w:rPr>
+            </w:r>
+            <w:r>
+              <w:rPr>
+                <w:sz w:val="18"/>
+                <w:rtl/>
+                <w:rtl/>
+              </w:rPr>
+              <w:t>23</w:t>
+            </w:r>
+          </w:p>
+        </w:tc>
+        <w:tc>
+          <w:tcPr>
+            <w:tcW w:type="dxa" w:w="3135"/>
+            <w:shd w:val="clear" w:color="auto" w:fill="F2F2F2"/>
+          </w:tcPr>
+          <w:p>
+            <w:pPr>
+              <w:bidi/>
+              <w:jc w:val="right"/>
+              <w:bidi/>
+            </w:pPr>
+            <w:r>
+              <w:rPr>
+                <w:rtl/>
+              </w:rPr>
+            </w:r>
+            <w:r>
+              <w:rPr>
+                <w:sz w:val="18"/>
+                <w:rtl/>
+                <w:rtl/>
+              </w:rPr>
+              <w:t>دفتر المستودع — الصادر</w:t>
+            </w:r>
+          </w:p>
+        </w:tc>
+        <w:tc>
+          <w:tcPr>
+            <w:tcW w:type="dxa" w:w="3135"/>
+            <w:shd w:val="clear" w:color="auto" w:fill="F2F2F2"/>
+          </w:tcPr>
+          <w:p>
+            <w:pPr>
+              <w:bidi/>
+              <w:jc w:val="right"/>
+              <w:bidi/>
+            </w:pPr>
+            <w:r>
+              <w:rPr>
+                <w:rtl/>
+              </w:rPr>
+            </w:r>
+            <w:r>
+              <w:rPr>
+                <w:sz w:val="18"/>
+                <w:rtl/>
+                <w:rtl/>
+              </w:rPr>
+              <w:t>إلزامي</w:t>
+            </w:r>
+          </w:p>
+        </w:tc>
+      </w:tr>
+      <w:tr>
+        <w:tc>
+          <w:tcPr>
+            <w:tcW w:type="dxa" w:w="3135"/>
+            <w:shd w:val="clear" w:color="auto" w:fill="FFFFFF"/>
+          </w:tcPr>
+          <w:p>
+            <w:pPr>
+              <w:bidi/>
+              <w:jc w:val="right"/>
+              <w:bidi/>
+            </w:pPr>
+            <w:r>
+              <w:rPr>
+                <w:rtl/>
+              </w:rPr>
+            </w:r>
+            <w:r>
+              <w:rPr>
+                <w:sz w:val="18"/>
+                <w:rtl/>
+                <w:rtl/>
+              </w:rPr>
+              <w:t>24</w:t>
+            </w:r>
+          </w:p>
+        </w:tc>
+        <w:tc>
+          <w:tcPr>
+            <w:tcW w:type="dxa" w:w="3135"/>
+            <w:shd w:val="clear" w:color="auto" w:fill="FFFFFF"/>
+          </w:tcPr>
+          <w:p>
+            <w:pPr>
+              <w:bidi/>
+              <w:jc w:val="right"/>
+              <w:bidi/>
+            </w:pPr>
+            <w:r>
+              <w:rPr>
+                <w:rtl/>
+              </w:rPr>
+            </w:r>
+            <w:r>
+              <w:rPr>
+                <w:sz w:val="18"/>
+                <w:rtl/>
+                <w:rtl/>
+              </w:rPr>
+              <w:t>دفتر الأصول الثابتة</w:t>
+            </w:r>
+          </w:p>
+        </w:tc>
+        <w:tc>
+          <w:tcPr>
+            <w:tcW w:type="dxa" w:w="3135"/>
+            <w:shd w:val="clear" w:color="auto" w:fill="FFFFFF"/>
+          </w:tcPr>
+          <w:p>
+            <w:pPr>
+              <w:bidi/>
+              <w:jc w:val="right"/>
+              <w:bidi/>
+            </w:pPr>
+            <w:r>
+              <w:rPr>
+                <w:rtl/>
+              </w:rPr>
+            </w:r>
+            <w:r>
+              <w:rPr>
+                <w:sz w:val="18"/>
+                <w:rtl/>
+                <w:rtl/>
+              </w:rPr>
+              <w:t>إلزامي</w:t>
+            </w:r>
+          </w:p>
+        </w:tc>
+      </w:tr>
+      <w:tr>
+        <w:tc>
+          <w:tcPr>
+            <w:tcW w:type="dxa" w:w="3135"/>
+            <w:shd w:val="clear" w:color="auto" w:fill="F2F2F2"/>
+          </w:tcPr>
+          <w:p>
+            <w:pPr>
+              <w:bidi/>
+              <w:jc w:val="right"/>
+              <w:bidi/>
+            </w:pPr>
+            <w:r>
+              <w:rPr>
+                <w:rtl/>
+              </w:rPr>
+            </w:r>
+            <w:r>
+              <w:rPr>
+                <w:sz w:val="18"/>
+                <w:rtl/>
+                <w:rtl/>
+              </w:rPr>
+              <w:t>25</w:t>
+            </w:r>
+          </w:p>
+        </w:tc>
+        <w:tc>
+          <w:tcPr>
+            <w:tcW w:type="dxa" w:w="3135"/>
+            <w:shd w:val="clear" w:color="auto" w:fill="F2F2F2"/>
+          </w:tcPr>
+          <w:p>
+            <w:pPr>
+              <w:bidi/>
+              <w:jc w:val="right"/>
+              <w:bidi/>
+            </w:pPr>
+            <w:r>
+              <w:rPr>
+                <w:rtl/>
+              </w:rPr>
+            </w:r>
+            <w:r>
+              <w:rPr>
+                <w:sz w:val="18"/>
+                <w:rtl/>
+                <w:rtl/>
+              </w:rPr>
+              <w:t>دفتر الإهلاك السنوي</w:t>
+            </w:r>
+          </w:p>
+        </w:tc>
+        <w:tc>
+          <w:tcPr>
+            <w:tcW w:type="dxa" w:w="3135"/>
+            <w:shd w:val="clear" w:color="auto" w:fill="F2F2F2"/>
+          </w:tcPr>
+          <w:p>
+            <w:pPr>
+              <w:bidi/>
+              <w:jc w:val="right"/>
+              <w:bidi/>
+            </w:pPr>
+            <w:r>
+              <w:rPr>
+                <w:rtl/>
+              </w:rPr>
+            </w:r>
+            <w:r>
+              <w:rPr>
+                <w:sz w:val="18"/>
+                <w:rtl/>
+                <w:rtl/>
+              </w:rPr>
+              <w:t>إلزامي</w:t>
+            </w:r>
+          </w:p>
+        </w:tc>
+      </w:tr>
+      <w:tr>
+        <w:tc>
+          <w:tcPr>
+            <w:tcW w:type="dxa" w:w="3135"/>
+            <w:shd w:val="clear" w:color="auto" w:fill="FFFFFF"/>
+          </w:tcPr>
+          <w:p>
+            <w:pPr>
+              <w:bidi/>
+              <w:jc w:val="right"/>
+              <w:bidi/>
+            </w:pPr>
+            <w:r>
+              <w:rPr>
+                <w:rtl/>
+              </w:rPr>
+            </w:r>
+            <w:r>
+              <w:rPr>
+                <w:sz w:val="18"/>
+                <w:rtl/>
+                <w:rtl/>
+              </w:rPr>
+              <w:t>26</w:t>
+            </w:r>
+          </w:p>
+        </w:tc>
+        <w:tc>
+          <w:tcPr>
+            <w:tcW w:type="dxa" w:w="3135"/>
+            <w:shd w:val="clear" w:color="auto" w:fill="FFFFFF"/>
+          </w:tcPr>
+          <w:p>
+            <w:pPr>
+              <w:bidi/>
+              <w:jc w:val="right"/>
+              <w:bidi/>
+            </w:pPr>
+            <w:r>
+              <w:rPr>
+                <w:rtl/>
+              </w:rPr>
+            </w:r>
+            <w:r>
+              <w:rPr>
+                <w:sz w:val="18"/>
+                <w:rtl/>
+                <w:rtl/>
+              </w:rPr>
+              <w:t>دفتر الجزاءات والمخالفات</w:t>
+            </w:r>
+          </w:p>
+        </w:tc>
+        <w:tc>
+          <w:tcPr>
+            <w:tcW w:type="dxa" w:w="3135"/>
+            <w:shd w:val="clear" w:color="auto" w:fill="FFFFFF"/>
+          </w:tcPr>
+          <w:p>
+            <w:pPr>
+              <w:bidi/>
+              <w:jc w:val="right"/>
+              <w:bidi/>
+            </w:pPr>
+            <w:r>
+              <w:rPr>
+                <w:rtl/>
+              </w:rPr>
+            </w:r>
+            <w:r>
+              <w:rPr>
+                <w:sz w:val="18"/>
+                <w:rtl/>
+                <w:rtl/>
+              </w:rPr>
+              <w:t>إلزامي</w:t>
+            </w:r>
+          </w:p>
+        </w:tc>
+      </w:tr>
+      <w:tr>
+        <w:tc>
+          <w:tcPr>
+            <w:tcW w:type="dxa" w:w="3135"/>
+            <w:shd w:val="clear" w:color="auto" w:fill="F2F2F2"/>
+          </w:tcPr>
+          <w:p>
+            <w:pPr>
+              <w:bidi/>
+              <w:jc w:val="right"/>
+              <w:bidi/>
+            </w:pPr>
+            <w:r>
+              <w:rPr>
+                <w:rtl/>
+              </w:rPr>
+            </w:r>
+            <w:r>
+              <w:rPr>
+                <w:sz w:val="18"/>
+                <w:rtl/>
+                <w:rtl/>
+              </w:rPr>
+              <w:t>27</w:t>
+            </w:r>
+          </w:p>
+        </w:tc>
+        <w:tc>
+          <w:tcPr>
+            <w:tcW w:type="dxa" w:w="3135"/>
+            <w:shd w:val="clear" w:color="auto" w:fill="F2F2F2"/>
+          </w:tcPr>
+          <w:p>
+            <w:pPr>
+              <w:bidi/>
+              <w:jc w:val="right"/>
+              <w:bidi/>
+            </w:pPr>
+            <w:r>
+              <w:rPr>
+                <w:rtl/>
+              </w:rPr>
+            </w:r>
+            <w:r>
+              <w:rPr>
+                <w:sz w:val="18"/>
+                <w:rtl/>
+                <w:rtl/>
+              </w:rPr>
+              <w:t>دفتر العقوبات والاستقطاعات</w:t>
+            </w:r>
+          </w:p>
+        </w:tc>
+        <w:tc>
+          <w:tcPr>
+            <w:tcW w:type="dxa" w:w="3135"/>
+            <w:shd w:val="clear" w:color="auto" w:fill="F2F2F2"/>
+          </w:tcPr>
+          <w:p>
+            <w:pPr>
+              <w:bidi/>
+              <w:jc w:val="right"/>
+              <w:bidi/>
+            </w:pPr>
+            <w:r>
+              <w:rPr>
+                <w:rtl/>
+              </w:rPr>
+            </w:r>
+            <w:r>
+              <w:rPr>
+                <w:sz w:val="18"/>
+                <w:rtl/>
+                <w:rtl/>
+              </w:rPr>
+              <w:t>إلزامي</w:t>
+            </w:r>
+          </w:p>
+        </w:tc>
+      </w:tr>
+      <w:tr>
+        <w:tc>
+          <w:tcPr>
+            <w:tcW w:type="dxa" w:w="3135"/>
+            <w:shd w:val="clear" w:color="auto" w:fill="FFFFFF"/>
+          </w:tcPr>
+          <w:p>
+            <w:pPr>
+              <w:bidi/>
+              <w:jc w:val="right"/>
+              <w:bidi/>
+            </w:pPr>
+            <w:r>
+              <w:rPr>
+                <w:rtl/>
+              </w:rPr>
+            </w:r>
+            <w:r>
+              <w:rPr>
+                <w:sz w:val="18"/>
+                <w:rtl/>
+                <w:rtl/>
+              </w:rPr>
+              <w:t>28</w:t>
+            </w:r>
+          </w:p>
+        </w:tc>
+        <w:tc>
+          <w:tcPr>
+            <w:tcW w:type="dxa" w:w="3135"/>
+            <w:shd w:val="clear" w:color="auto" w:fill="FFFFFF"/>
+          </w:tcPr>
+          <w:p>
+            <w:pPr>
+              <w:bidi/>
+              <w:jc w:val="right"/>
+              <w:bidi/>
+            </w:pPr>
+            <w:r>
+              <w:rPr>
+                <w:rtl/>
+              </w:rPr>
+            </w:r>
+            <w:r>
+              <w:rPr>
+                <w:sz w:val="18"/>
+                <w:rtl/>
+                <w:rtl/>
+              </w:rPr>
+              <w:t>دفتر المزادات والممتلكات الحكومية</w:t>
+            </w:r>
+          </w:p>
+        </w:tc>
+        <w:tc>
+          <w:tcPr>
+            <w:tcW w:type="dxa" w:w="3135"/>
+            <w:shd w:val="clear" w:color="auto" w:fill="FFFFFF"/>
+          </w:tcPr>
+          <w:p>
+            <w:pPr>
+              <w:bidi/>
+              <w:jc w:val="right"/>
+              <w:bidi/>
+            </w:pPr>
+            <w:r>
+              <w:rPr>
+                <w:rtl/>
+              </w:rPr>
+            </w:r>
+            <w:r>
+              <w:rPr>
+                <w:sz w:val="18"/>
+                <w:rtl/>
+                <w:rtl/>
+              </w:rPr>
+              <w:t>إلزامي</w:t>
+            </w:r>
+          </w:p>
+        </w:tc>
+      </w:tr>
+      <w:tr>
+        <w:tc>
+          <w:tcPr>
+            <w:tcW w:type="dxa" w:w="3135"/>
+            <w:shd w:val="clear" w:color="auto" w:fill="F2F2F2"/>
+          </w:tcPr>
+          <w:p>
+            <w:pPr>
+              <w:bidi/>
+              <w:jc w:val="right"/>
+              <w:bidi/>
+            </w:pPr>
+            <w:r>
+              <w:rPr>
+                <w:rtl/>
+              </w:rPr>
+            </w:r>
+            <w:r>
+              <w:rPr>
+                <w:sz w:val="18"/>
+                <w:rtl/>
+                <w:rtl/>
+              </w:rPr>
+              <w:t>29</w:t>
+            </w:r>
+          </w:p>
+        </w:tc>
+        <w:tc>
+          <w:tcPr>
+            <w:tcW w:type="dxa" w:w="3135"/>
+            <w:shd w:val="clear" w:color="auto" w:fill="F2F2F2"/>
+          </w:tcPr>
+          <w:p>
+            <w:pPr>
+              <w:bidi/>
+              <w:jc w:val="right"/>
+              <w:bidi/>
+            </w:pPr>
+            <w:r>
+              <w:rPr>
+                <w:rtl/>
+              </w:rPr>
+            </w:r>
+            <w:r>
+              <w:rPr>
+                <w:sz w:val="18"/>
+                <w:rtl/>
+                <w:rtl/>
+              </w:rPr>
+              <w:t>دفتر المخصصات والاحتياطيات</w:t>
+            </w:r>
+          </w:p>
+        </w:tc>
+        <w:tc>
+          <w:tcPr>
+            <w:tcW w:type="dxa" w:w="3135"/>
+            <w:shd w:val="clear" w:color="auto" w:fill="F2F2F2"/>
+          </w:tcPr>
+          <w:p>
+            <w:pPr>
+              <w:bidi/>
+              <w:jc w:val="right"/>
+              <w:bidi/>
+            </w:pPr>
+            <w:r>
+              <w:rPr>
+                <w:rtl/>
+              </w:rPr>
+            </w:r>
+            <w:r>
+              <w:rPr>
+                <w:sz w:val="18"/>
+                <w:rtl/>
+                <w:rtl/>
+              </w:rPr>
+              <w:t>إلزامي</w:t>
+            </w:r>
+          </w:p>
+        </w:tc>
+      </w:tr>
+      <w:tr>
+        <w:tc>
+          <w:tcPr>
+            <w:tcW w:type="dxa" w:w="3135"/>
+            <w:shd w:val="clear" w:color="auto" w:fill="FFFFFF"/>
+          </w:tcPr>
+          <w:p>
+            <w:pPr>
+              <w:bidi/>
+              <w:jc w:val="right"/>
+              <w:bidi/>
+            </w:pPr>
+            <w:r>
+              <w:rPr>
+                <w:rtl/>
+              </w:rPr>
+            </w:r>
+            <w:r>
+              <w:rPr>
+                <w:sz w:val="18"/>
+                <w:rtl/>
+                <w:rtl/>
+              </w:rPr>
+              <w:t>—</w:t>
+            </w:r>
+          </w:p>
+        </w:tc>
+        <w:tc>
+          <w:tcPr>
+            <w:tcW w:type="dxa" w:w="3135"/>
+            <w:shd w:val="clear" w:color="auto" w:fill="FFFFFF"/>
+          </w:tcPr>
+          <w:p>
+            <w:pPr>
+              <w:bidi/>
+              <w:jc w:val="right"/>
+              <w:bidi/>
+            </w:pPr>
+            <w:r>
+              <w:rPr>
+                <w:rtl/>
+              </w:rPr>
+            </w:r>
+            <w:r>
+              <w:rPr>
+                <w:sz w:val="18"/>
+                <w:rtl/>
+                <w:rtl/>
+              </w:rPr>
+              <w:t>ترقيم تسلسلي قانوني لكل دفتر-سنة-فولية</w:t>
+            </w:r>
+          </w:p>
+        </w:tc>
+        <w:tc>
+          <w:tcPr>
+            <w:tcW w:type="dxa" w:w="3135"/>
+            <w:shd w:val="clear" w:color="auto" w:fill="FFFFFF"/>
+          </w:tcPr>
+          <w:p>
+            <w:pPr>
+              <w:bidi/>
+              <w:jc w:val="right"/>
+              <w:bidi/>
+            </w:pPr>
+            <w:r>
+              <w:rPr>
+                <w:rtl/>
+              </w:rPr>
+            </w:r>
+            <w:r>
+              <w:rPr>
+                <w:sz w:val="18"/>
+                <w:rtl/>
+                <w:rtl/>
+              </w:rPr>
+              <w:t>إلزامي</w:t>
+            </w:r>
+          </w:p>
+        </w:tc>
+      </w:tr>
+      <w:tr>
+        <w:tc>
+          <w:tcPr>
+            <w:tcW w:type="dxa" w:w="3135"/>
+            <w:shd w:val="clear" w:color="auto" w:fill="F2F2F2"/>
+          </w:tcPr>
+          <w:p>
+            <w:pPr>
+              <w:bidi/>
+              <w:jc w:val="right"/>
+              <w:bidi/>
+            </w:pPr>
+            <w:r>
+              <w:rPr>
+                <w:rtl/>
+              </w:rPr>
+            </w:r>
+            <w:r>
+              <w:rPr>
+                <w:sz w:val="18"/>
+                <w:rtl/>
+                <w:rtl/>
+              </w:rPr>
+              <w:t>—</w:t>
+            </w:r>
+          </w:p>
+        </w:tc>
+        <w:tc>
+          <w:tcPr>
+            <w:tcW w:type="dxa" w:w="3135"/>
+            <w:shd w:val="clear" w:color="auto" w:fill="F2F2F2"/>
+          </w:tcPr>
+          <w:p>
+            <w:pPr>
+              <w:bidi/>
+              <w:jc w:val="right"/>
+              <w:bidi/>
+            </w:pPr>
+            <w:r>
+              <w:rPr>
+                <w:rtl/>
+              </w:rPr>
+            </w:r>
+            <w:r>
+              <w:rPr>
+                <w:sz w:val="18"/>
+                <w:rtl/>
+                <w:rtl/>
+              </w:rPr>
               <w:t>ترحيل شهري (نقل بعده / من قبله)</w:t>
+            </w:r>
+          </w:p>
+        </w:tc>
+        <w:tc>
+          <w:tcPr>
+            <w:tcW w:type="dxa" w:w="3135"/>
+            <w:shd w:val="clear" w:color="auto" w:fill="F2F2F2"/>
+          </w:tcPr>
+          <w:p>
+            <w:pPr>
+              <w:bidi/>
+              <w:jc w:val="right"/>
+              <w:bidi/>
+            </w:pPr>
+            <w:r>
+              <w:rPr>
+                <w:rtl/>
+              </w:rPr>
+            </w:r>
+            <w:r>
+              <w:rPr>
+                <w:sz w:val="18"/>
+                <w:rtl/>
+                <w:rtl/>
+              </w:rPr>
+              <w:t>إلزامي</w:t>
+            </w:r>
+          </w:p>
+        </w:tc>
+      </w:tr>
+      <w:tr>
+        <w:tc>
+          <w:tcPr>
+            <w:tcW w:type="dxa" w:w="3135"/>
+            <w:shd w:val="clear" w:color="auto" w:fill="FFFFFF"/>
+          </w:tcPr>
+          <w:p>
+            <w:pPr>
+              <w:bidi/>
+              <w:jc w:val="right"/>
+              <w:bidi/>
+            </w:pPr>
+            <w:r>
+              <w:rPr>
+                <w:rtl/>
+              </w:rPr>
+            </w:r>
+            <w:r>
+              <w:rPr>
+                <w:sz w:val="18"/>
+                <w:rtl/>
+                <w:rtl/>
+              </w:rPr>
+              <w:t>—</w:t>
+            </w:r>
+          </w:p>
+        </w:tc>
+        <w:tc>
+          <w:tcPr>
+            <w:tcW w:type="dxa" w:w="3135"/>
+            <w:shd w:val="clear" w:color="auto" w:fill="FFFFFF"/>
+          </w:tcPr>
+          <w:p>
+            <w:pPr>
+              <w:bidi/>
+              <w:jc w:val="right"/>
+              <w:bidi/>
+            </w:pPr>
+            <w:r>
+              <w:rPr>
+                <w:rtl/>
+              </w:rPr>
+            </w:r>
+            <w:r>
+              <w:rPr>
+                <w:sz w:val="18"/>
+                <w:rtl/>
+                <w:rtl/>
+              </w:rPr>
+              <w:t>توقيع موظف الشطب ورئيس الحسابات</w:t>
             </w:r>
           </w:p>
         </w:tc>

</xml_diff>